<commit_message>
Organize by feature: Features/SOW1-SOW2_Secure_Communication (requirements, review, summary)
</commit_message>
<xml_diff>
--- a/CS-Testing/README_CS-Testing.docx
+++ b/CS-Testing/README_CS-Testing.docx
@@ -387,7 +387,7 @@
                 <w:rFonts w:ascii="Arial" w:hAnsi="Arial"/>
                 <w:sz w:val="17"/>
               </w:rPr>
-              <w:t xml:space="preserve">05-Requirements-Inbox/</w:t>
+              <w:t>Features/&lt;feature name&gt;/01-Requirements/</w:t>
             </w:r>
           </w:p>
         </w:tc>
@@ -615,7 +615,7 @@
         <w:rPr>
           <w:rStyle w:val="VerbatimChar"/>
         </w:rPr>
-        <w:t xml:space="preserve">05-Requirements-Inbox/</w:t>
+        <w:t>Features/&lt;feature name&gt;/01-Requirements/</w:t>
       </w:r>
       <w:r>
         <w:t xml:space="preserve"> </w:t>

</xml_diff>